<commit_message>
Update downloadable CV: header URLs are now clickable hyperlinks
Co-Authored-By: Claude Opus 4.7 (1M context) <noreply@anthropic.com>
</commit_message>
<xml_diff>
--- a/public/cv.docx
+++ b/public/cv.docx
@@ -34,6 +34,15 @@
       <w:pPr>
         <w:spacing w:before="0" w:after="80" w:line="276" w:lineRule="auto"/>
       </w:pPr>
+      <w:hyperlink r:id="rId9">
+        <w:r>
+          <w:rPr>
+            <w:rFonts w:ascii="Calibri" w:hAnsi="Calibri" w:cs="Calibri"/>
+            <w:sz w:val="22"/>
+          </w:rPr>
+          <w:t xml:space="preserve">https://engelen.io</w:t>
+        </w:r>
+      </w:hyperlink>
       <w:r>
         <w:rPr>
           <w:rFonts w:ascii="Calibri" w:hAnsi="Calibri"/>
@@ -41,8 +50,35 @@
           <w:i w:val="0"/>
           <w:sz w:val="22"/>
         </w:rPr>
-        <w:t>https://engelen.io  |  https://linkedin.com/in/nico-engelen  |  https://github.com/nick-o</w:t>
+        <w:t xml:space="preserve">  |  </w:t>
       </w:r>
+      <w:hyperlink r:id="rId10">
+        <w:r>
+          <w:rPr>
+            <w:rFonts w:ascii="Calibri" w:hAnsi="Calibri" w:cs="Calibri"/>
+            <w:sz w:val="22"/>
+          </w:rPr>
+          <w:t xml:space="preserve">https://linkedin.com/in/nico-engelen</w:t>
+        </w:r>
+      </w:hyperlink>
+      <w:r>
+        <w:rPr>
+          <w:rFonts w:ascii="Calibri" w:hAnsi="Calibri"/>
+          <w:b w:val="0"/>
+          <w:i w:val="0"/>
+          <w:sz w:val="22"/>
+        </w:rPr>
+        <w:t xml:space="preserve">  |  </w:t>
+      </w:r>
+      <w:hyperlink r:id="rId11">
+        <w:r>
+          <w:rPr>
+            <w:rFonts w:ascii="Calibri" w:hAnsi="Calibri" w:cs="Calibri"/>
+            <w:sz w:val="22"/>
+          </w:rPr>
+          <w:t xml:space="preserve">https://github.com/nick-o</w:t>
+        </w:r>
+      </w:hyperlink>
     </w:p>
     <w:p>
       <w:pPr>

</xml_diff>

<commit_message>
Update downloadable CV: email is mailto:, phone is tel:
Co-Authored-By: Claude Opus 4.7 (1M context) <noreply@anthropic.com>
</commit_message>
<xml_diff>
--- a/public/cv.docx
+++ b/public/cv.docx
@@ -27,14 +27,41 @@
           <w:i w:val="0"/>
           <w:sz w:val="22"/>
         </w:rPr>
-        <w:t>Berlin, Germany  |  nico@engelen.io  |  +49 176 5798 0299</w:t>
+        <w:t xml:space="preserve">Berlin, Germany  |  </w:t>
       </w:r>
+      <w:hyperlink r:id="rId9">
+        <w:r>
+          <w:rPr>
+            <w:rFonts w:ascii="Calibri" w:hAnsi="Calibri" w:cs="Calibri"/>
+            <w:sz w:val="22"/>
+          </w:rPr>
+          <w:t xml:space="preserve">nico@engelen.io</w:t>
+        </w:r>
+      </w:hyperlink>
+      <w:r>
+        <w:rPr>
+          <w:rFonts w:ascii="Calibri" w:hAnsi="Calibri"/>
+          <w:b w:val="0"/>
+          <w:i w:val="0"/>
+          <w:sz w:val="22"/>
+        </w:rPr>
+        <w:t xml:space="preserve">  |  </w:t>
+      </w:r>
+      <w:hyperlink r:id="rId10">
+        <w:r>
+          <w:rPr>
+            <w:rFonts w:ascii="Calibri" w:hAnsi="Calibri" w:cs="Calibri"/>
+            <w:sz w:val="22"/>
+          </w:rPr>
+          <w:t xml:space="preserve">+49 176 5798 0299</w:t>
+        </w:r>
+      </w:hyperlink>
     </w:p>
     <w:p>
       <w:pPr>
         <w:spacing w:before="0" w:after="80" w:line="276" w:lineRule="auto"/>
       </w:pPr>
-      <w:hyperlink r:id="rId9">
+      <w:hyperlink r:id="rId11">
         <w:r>
           <w:rPr>
             <w:rFonts w:ascii="Calibri" w:hAnsi="Calibri" w:cs="Calibri"/>
@@ -52,7 +79,7 @@
         </w:rPr>
         <w:t xml:space="preserve">  |  </w:t>
       </w:r>
-      <w:hyperlink r:id="rId10">
+      <w:hyperlink r:id="rId12">
         <w:r>
           <w:rPr>
             <w:rFonts w:ascii="Calibri" w:hAnsi="Calibri" w:cs="Calibri"/>
@@ -70,7 +97,7 @@
         </w:rPr>
         <w:t xml:space="preserve">  |  </w:t>
       </w:r>
-      <w:hyperlink r:id="rId11">
+      <w:hyperlink r:id="rId13">
         <w:r>
           <w:rPr>
             <w:rFonts w:ascii="Calibri" w:hAnsi="Calibri" w:cs="Calibri"/>

</xml_diff>